<commit_message>
Add fair 19-block rolling validation
</commit_message>
<xml_diff>
--- a/docs/Gold_Model_Project_Notes.docx
+++ b/docs/Gold_Model_Project_Notes.docx
@@ -6946,6 +6946,359 @@
     <w:p>
       <w:r>
         <w:t>Future experiments should use focused commits with the code, configuration, tests and compact report required to reproduce the decision. Full market data, credentials and unreviewed generated artifacts remain local.</w:t>
+      </w:r>
+    </w:p>
+    <w:p>
+      <w:pPr>
+        <w:pStyle w:val="Heading1"/>
+      </w:pPr>
+      <w:r>
+        <w:t>Fair 19-Block Rolling Huber Validation - 2026-07-22</w:t>
+      </w:r>
+    </w:p>
+    <w:p>
+      <w:r>
+        <w:t>The prior expanding-window proposal would give later models more training observations. The maintained fairness experiment instead divides the usable sample into 19 equal chronological blocks. Each of ten Huber models trains on the immediately preceding nine blocks and predicts the next block.</w:t>
+      </w:r>
+    </w:p>
+    <w:p>
+      <w:pPr>
+        <w:pStyle w:val="Heading2"/>
+      </w:pPr>
+      <w:r>
+        <w:t>Exact construction</w:t>
+      </w:r>
+    </w:p>
+    <w:p>
+      <w:pPr>
+        <w:pStyle w:val="ListBullet"/>
+      </w:pPr>
+      <w:r>
+        <w:t>Available event-filtered observations: 2,728.</w:t>
+      </w:r>
+    </w:p>
+    <w:p>
+      <w:pPr>
+        <w:pStyle w:val="ListBullet"/>
+      </w:pPr>
+      <w:r>
+        <w:t>Equal blocks: 19 blocks of 143 observations.</w:t>
+      </w:r>
+    </w:p>
+    <w:p>
+      <w:pPr>
+        <w:pStyle w:val="ListBullet"/>
+      </w:pPr>
+      <w:r>
+        <w:t>Oldest remainder excluded from this diagnostic: 11 observations.</w:t>
+      </w:r>
+    </w:p>
+    <w:p>
+      <w:pPr>
+        <w:pStyle w:val="ListBullet"/>
+      </w:pPr>
+      <w:r>
+        <w:t>Training observations per model: 1,287.</w:t>
+      </w:r>
+    </w:p>
+    <w:p>
+      <w:pPr>
+        <w:pStyle w:val="ListBullet"/>
+      </w:pPr>
+      <w:r>
+        <w:t>Test observations per model: 143.</w:t>
+      </w:r>
+    </w:p>
+    <w:p>
+      <w:pPr>
+        <w:pStyle w:val="ListBullet"/>
+      </w:pPr>
+      <w:r>
+        <w:t>Combined leakage-free test predictions: 1,430.</w:t>
+      </w:r>
+    </w:p>
+    <w:p>
+      <w:pPr>
+        <w:pStyle w:val="ListBullet"/>
+      </w:pPr>
+      <w:r>
+        <w:t>Fixed model definition: current 14 features, Huber epsilon=1.1 and alpha=0.001.</w:t>
+      </w:r>
+    </w:p>
+    <w:p>
+      <w:r>
+        <w:t>Model 1 trains on blocks 1-9 and tests block 10. The window then moves forward one block at a time. Model 10 trains on blocks 10-18 and tests block 19. Every training date precedes its test dates, and every training target is observable by the first signal date of the corresponding test block.</w:t>
+      </w:r>
+    </w:p>
+    <w:p>
+      <w:pPr>
+        <w:pStyle w:val="Heading2"/>
+      </w:pPr>
+      <w:r>
+        <w:t>Leakage-free amount results</w:t>
+      </w:r>
+    </w:p>
+    <w:tbl>
+      <w:tblPr>
+        <w:tblStyle w:val="TableGrid"/>
+        <w:tblW w:type="auto" w:w="0"/>
+        <w:tblLook w:firstColumn="1" w:firstRow="1" w:lastColumn="0" w:lastRow="0" w:noHBand="0" w:noVBand="1" w:val="04A0"/>
+      </w:tblPr>
+      <w:tblGrid>
+        <w:gridCol w:w="4968"/>
+        <w:gridCol w:w="4968"/>
+      </w:tblGrid>
+      <w:tr>
+        <w:tc>
+          <w:tcPr>
+            <w:tcW w:type="dxa" w:w="4968"/>
+          </w:tcPr>
+          <w:p>
+            <w:r>
+              <w:t>Metric</w:t>
+            </w:r>
+          </w:p>
+        </w:tc>
+        <w:tc>
+          <w:tcPr>
+            <w:tcW w:type="dxa" w:w="4968"/>
+          </w:tcPr>
+          <w:p>
+            <w:r>
+              <w:t>Result</w:t>
+            </w:r>
+          </w:p>
+        </w:tc>
+      </w:tr>
+      <w:tr>
+        <w:tc>
+          <w:tcPr>
+            <w:tcW w:type="dxa" w:w="4968"/>
+          </w:tcPr>
+          <w:p>
+            <w:r>
+              <w:t>Growth MAE</w:t>
+            </w:r>
+          </w:p>
+        </w:tc>
+        <w:tc>
+          <w:tcPr>
+            <w:tcW w:type="dxa" w:w="4968"/>
+          </w:tcPr>
+          <w:p>
+            <w:r>
+              <w:t>0.639 percentage points</w:t>
+            </w:r>
+          </w:p>
+        </w:tc>
+      </w:tr>
+      <w:tr>
+        <w:tc>
+          <w:tcPr>
+            <w:tcW w:type="dxa" w:w="4968"/>
+          </w:tcPr>
+          <w:p>
+            <w:r>
+              <w:t>Growth RMSE</w:t>
+            </w:r>
+          </w:p>
+        </w:tc>
+        <w:tc>
+          <w:tcPr>
+            <w:tcW w:type="dxa" w:w="4968"/>
+          </w:tcPr>
+          <w:p>
+            <w:r>
+              <w:t>0.908 percentage points</w:t>
+            </w:r>
+          </w:p>
+        </w:tc>
+      </w:tr>
+      <w:tr>
+        <w:tc>
+          <w:tcPr>
+            <w:tcW w:type="dxa" w:w="4968"/>
+          </w:tcPr>
+          <w:p>
+            <w:r>
+              <w:t>Growth-magnitude MAE</w:t>
+            </w:r>
+          </w:p>
+        </w:tc>
+        <w:tc>
+          <w:tcPr>
+            <w:tcW w:type="dxa" w:w="4968"/>
+          </w:tcPr>
+          <w:p>
+            <w:r>
+              <w:t>0.517 percentage points</w:t>
+            </w:r>
+          </w:p>
+        </w:tc>
+      </w:tr>
+      <w:tr>
+        <w:tc>
+          <w:tcPr>
+            <w:tcW w:type="dxa" w:w="4968"/>
+          </w:tcPr>
+          <w:p>
+            <w:r>
+              <w:t>Growth bias</w:t>
+            </w:r>
+          </w:p>
+        </w:tc>
+        <w:tc>
+          <w:tcPr>
+            <w:tcW w:type="dxa" w:w="4968"/>
+          </w:tcPr>
+          <w:p>
+            <w:r>
+              <w:t>-0.011 percentage points</w:t>
+            </w:r>
+          </w:p>
+        </w:tc>
+      </w:tr>
+      <w:tr>
+        <w:tc>
+          <w:tcPr>
+            <w:tcW w:type="dxa" w:w="4968"/>
+          </w:tcPr>
+          <w:p>
+            <w:r>
+              <w:t>Price-change MAE</w:t>
+            </w:r>
+          </w:p>
+        </w:tc>
+        <w:tc>
+          <w:tcPr>
+            <w:tcW w:type="dxa" w:w="4968"/>
+          </w:tcPr>
+          <w:p>
+            <w:r>
+              <w:t>3.531 CNY/gram</w:t>
+            </w:r>
+          </w:p>
+        </w:tc>
+      </w:tr>
+      <w:tr>
+        <w:tc>
+          <w:tcPr>
+            <w:tcW w:type="dxa" w:w="4968"/>
+          </w:tcPr>
+          <w:p>
+            <w:r>
+              <w:t>Price-change RMSE</w:t>
+            </w:r>
+          </w:p>
+        </w:tc>
+        <w:tc>
+          <w:tcPr>
+            <w:tcW w:type="dxa" w:w="4968"/>
+          </w:tcPr>
+          <w:p>
+            <w:r>
+              <w:t>5.640 CNY/gram</w:t>
+            </w:r>
+          </w:p>
+        </w:tc>
+      </w:tr>
+    </w:tbl>
+    <w:p>
+      <w:pPr>
+        <w:pStyle w:val="Heading2"/>
+      </w:pPr>
+      <w:r>
+        <w:t>Window and coefficient stability</w:t>
+      </w:r>
+    </w:p>
+    <w:p>
+      <w:r>
+        <w:t>Growth MAE ranged from 0.428 to 0.817 percentage points. Model 5 (2022-10-14 to 2023-05-16) had the lowest MAE; model 10 (2025-10-20 to 2026-06-23) had the highest. XAUUSD daily return, the momentum-volatility interaction, premium change, breakeven inflation and volatility retained the same coefficient sign in all ten models. USD/CNH daily return and the 20-day moving-average gap were the least sign-stable.</w:t>
+      </w:r>
+    </w:p>
+    <w:p>
+      <w:pPr>
+        <w:pStyle w:val="Heading2"/>
+      </w:pPr>
+      <w:r>
+        <w:t>Interpretation</w:t>
+      </w:r>
+    </w:p>
+    <w:p>
+      <w:r>
+        <w:t>The new MAE is higher than the old blocked ten-fold diagnostic, which is expected because the new training windows contain no dates after their test blocks. The two error totals are not perfectly comparable because they cover different test rows. The 19-block result is now the primary fair validation; the old ten-fold rotation remains only a coefficient-stability diagnostic.</w:t>
+      </w:r>
+    </w:p>
+    <w:p>
+      <w:pPr>
+        <w:pStyle w:val="Heading2"/>
+      </w:pPr>
+      <w:r>
+        <w:t>Reproducibility outputs</w:t>
+      </w:r>
+    </w:p>
+    <w:p>
+      <w:pPr>
+        <w:pStyle w:val="ListBullet"/>
+      </w:pPr>
+      <w:r>
+        <w:t>huber_rolling_19block_cv.py</w:t>
+      </w:r>
+    </w:p>
+    <w:p>
+      <w:pPr>
+        <w:pStyle w:val="ListBullet"/>
+      </w:pPr>
+      <w:r>
+        <w:t>outputs/huber_rolling_19block/models/</w:t>
+      </w:r>
+    </w:p>
+    <w:p>
+      <w:pPr>
+        <w:pStyle w:val="ListBullet"/>
+      </w:pPr>
+      <w:r>
+        <w:t>outputs/huber_rolling_19block/rolling_overall_metrics.csv</w:t>
+      </w:r>
+    </w:p>
+    <w:p>
+      <w:pPr>
+        <w:pStyle w:val="ListBullet"/>
+      </w:pPr>
+      <w:r>
+        <w:t>outputs/huber_rolling_19block/rolling_fold_metrics.csv</w:t>
+      </w:r>
+    </w:p>
+    <w:p>
+      <w:pPr>
+        <w:pStyle w:val="ListBullet"/>
+      </w:pPr>
+      <w:r>
+        <w:t>outputs/huber_rolling_19block/rolling_oos_predictions.csv</w:t>
+      </w:r>
+    </w:p>
+    <w:p>
+      <w:pPr>
+        <w:pStyle w:val="ListBullet"/>
+      </w:pPr>
+      <w:r>
+        <w:t>outputs/huber_rolling_19block/rolling_coefficient_stability.csv</w:t>
+      </w:r>
+    </w:p>
+    <w:p>
+      <w:pPr>
+        <w:pStyle w:val="ListBullet"/>
+      </w:pPr>
+      <w:r>
+        <w:t>reports/huber_rolling_19block_predictions.png</w:t>
+      </w:r>
+    </w:p>
+    <w:p>
+      <w:pPr>
+        <w:pStyle w:val="ListBullet"/>
+      </w:pPr>
+      <w:r>
+        <w:t>reports/huber_rolling_19block_fold_errors.png</w:t>
       </w:r>
     </w:p>
     <w:sectPr>

</xml_diff>

<commit_message>
Add locked Block 19 ensemble test
</commit_message>
<xml_diff>
--- a/docs/Gold_Model_Project_Notes.docx
+++ b/docs/Gold_Model_Project_Notes.docx
@@ -7299,6 +7299,292 @@
       </w:pPr>
       <w:r>
         <w:t>reports/huber_rolling_19block_fold_errors.png</w:t>
+      </w:r>
+    </w:p>
+    <w:p>
+      <w:pPr>
+        <w:pStyle w:val="Heading1"/>
+      </w:pPr>
+      <w:r>
+        <w:t>Locked Block 19 common model test</w:t>
+      </w:r>
+    </w:p>
+    <w:p>
+      <w:r>
+        <w:t>The dataset remains divided into 19 equal chronological blocks of 143 observations. Blocks 1-18 form the development area. Rolling development predictions train on nine immediately preceding blocks and score Blocks 10-18. Block 19 is excluded from all model fitting and voting-weight calculation, then used as the common 143-row test period.</w:t>
+      </w:r>
+    </w:p>
+    <w:p>
+      <w:r>
+        <w:t>Final OLS, Ridge, Lasso, Elastic Net and Bagged Huber models all use the same 1,287 observations from Blocks 10-18. Continuous voting weights are the normalized inverse of each model's development out-of-sample growth MAE, so a larger amount error receives a smaller weight.</w:t>
+      </w:r>
+    </w:p>
+    <w:tbl>
+      <w:tblPr>
+        <w:tblStyle w:val="TableGrid"/>
+        <w:tblW w:type="auto" w:w="0"/>
+        <w:tblLayout w:type="fixed"/>
+        <w:tblLook w:firstColumn="1" w:firstRow="1" w:lastColumn="0" w:lastRow="0" w:noHBand="0" w:noVBand="1" w:val="04A0"/>
+      </w:tblPr>
+      <w:tblGrid>
+        <w:gridCol w:w="3312"/>
+        <w:gridCol w:w="3312"/>
+        <w:gridCol w:w="3312"/>
+      </w:tblGrid>
+      <w:tr>
+        <w:tc>
+          <w:tcPr>
+            <w:tcW w:type="dxa" w:w="3456"/>
+            <w:vAlign w:val="center"/>
+          </w:tcPr>
+          <w:p>
+            <w:r>
+              <w:t>Candidate</w:t>
+            </w:r>
+          </w:p>
+        </w:tc>
+        <w:tc>
+          <w:tcPr>
+            <w:tcW w:type="dxa" w:w="2592"/>
+            <w:vAlign w:val="center"/>
+          </w:tcPr>
+          <w:p>
+            <w:r>
+              <w:t>Growth MAE (pp)</w:t>
+            </w:r>
+          </w:p>
+        </w:tc>
+        <w:tc>
+          <w:tcPr>
+            <w:tcW w:type="dxa" w:w="3312"/>
+            <w:vAlign w:val="center"/>
+          </w:tcPr>
+          <w:p>
+            <w:r>
+              <w:t>Price-change MAE (CNY/g)</w:t>
+            </w:r>
+          </w:p>
+        </w:tc>
+      </w:tr>
+      <w:tr>
+        <w:tc>
+          <w:tcPr>
+            <w:tcW w:type="dxa" w:w="3456"/>
+            <w:vAlign w:val="center"/>
+          </w:tcPr>
+          <w:p>
+            <w:r>
+              <w:t>BaggedHuber</w:t>
+            </w:r>
+          </w:p>
+        </w:tc>
+        <w:tc>
+          <w:tcPr>
+            <w:tcW w:type="dxa" w:w="2592"/>
+            <w:vAlign w:val="center"/>
+          </w:tcPr>
+          <w:p>
+            <w:r>
+              <w:t>0.797</w:t>
+            </w:r>
+          </w:p>
+        </w:tc>
+        <w:tc>
+          <w:tcPr>
+            <w:tcW w:type="dxa" w:w="3312"/>
+            <w:vAlign w:val="center"/>
+          </w:tcPr>
+          <w:p>
+            <w:r>
+              <w:t>8.065</w:t>
+            </w:r>
+          </w:p>
+        </w:tc>
+      </w:tr>
+      <w:tr>
+        <w:tc>
+          <w:tcPr>
+            <w:tcW w:type="dxa" w:w="3456"/>
+            <w:vAlign w:val="center"/>
+          </w:tcPr>
+          <w:p>
+            <w:r>
+              <w:t>WeightedEnsemble</w:t>
+            </w:r>
+          </w:p>
+        </w:tc>
+        <w:tc>
+          <w:tcPr>
+            <w:tcW w:type="dxa" w:w="2592"/>
+            <w:vAlign w:val="center"/>
+          </w:tcPr>
+          <w:p>
+            <w:r>
+              <w:t>0.816</w:t>
+            </w:r>
+          </w:p>
+        </w:tc>
+        <w:tc>
+          <w:tcPr>
+            <w:tcW w:type="dxa" w:w="3312"/>
+            <w:vAlign w:val="center"/>
+          </w:tcPr>
+          <w:p>
+            <w:r>
+              <w:t>8.257</w:t>
+            </w:r>
+          </w:p>
+        </w:tc>
+      </w:tr>
+      <w:tr>
+        <w:tc>
+          <w:tcPr>
+            <w:tcW w:type="dxa" w:w="3456"/>
+            <w:vAlign w:val="center"/>
+          </w:tcPr>
+          <w:p>
+            <w:r>
+              <w:t>Lasso</w:t>
+            </w:r>
+          </w:p>
+        </w:tc>
+        <w:tc>
+          <w:tcPr>
+            <w:tcW w:type="dxa" w:w="2592"/>
+            <w:vAlign w:val="center"/>
+          </w:tcPr>
+          <w:p>
+            <w:r>
+              <w:t>0.823</w:t>
+            </w:r>
+          </w:p>
+        </w:tc>
+        <w:tc>
+          <w:tcPr>
+            <w:tcW w:type="dxa" w:w="3312"/>
+            <w:vAlign w:val="center"/>
+          </w:tcPr>
+          <w:p>
+            <w:r>
+              <w:t>8.342</w:t>
+            </w:r>
+          </w:p>
+        </w:tc>
+      </w:tr>
+      <w:tr>
+        <w:tc>
+          <w:tcPr>
+            <w:tcW w:type="dxa" w:w="3456"/>
+            <w:vAlign w:val="center"/>
+          </w:tcPr>
+          <w:p>
+            <w:r>
+              <w:t>ElasticNet</w:t>
+            </w:r>
+          </w:p>
+        </w:tc>
+        <w:tc>
+          <w:tcPr>
+            <w:tcW w:type="dxa" w:w="2592"/>
+            <w:vAlign w:val="center"/>
+          </w:tcPr>
+          <w:p>
+            <w:r>
+              <w:t>0.824</w:t>
+            </w:r>
+          </w:p>
+        </w:tc>
+        <w:tc>
+          <w:tcPr>
+            <w:tcW w:type="dxa" w:w="3312"/>
+            <w:vAlign w:val="center"/>
+          </w:tcPr>
+          <w:p>
+            <w:r>
+              <w:t>8.345</w:t>
+            </w:r>
+          </w:p>
+        </w:tc>
+      </w:tr>
+      <w:tr>
+        <w:tc>
+          <w:tcPr>
+            <w:tcW w:type="dxa" w:w="3456"/>
+            <w:vAlign w:val="center"/>
+          </w:tcPr>
+          <w:p>
+            <w:r>
+              <w:t>Ridge</w:t>
+            </w:r>
+          </w:p>
+        </w:tc>
+        <w:tc>
+          <w:tcPr>
+            <w:tcW w:type="dxa" w:w="2592"/>
+            <w:vAlign w:val="center"/>
+          </w:tcPr>
+          <w:p>
+            <w:r>
+              <w:t>0.824</w:t>
+            </w:r>
+          </w:p>
+        </w:tc>
+        <w:tc>
+          <w:tcPr>
+            <w:tcW w:type="dxa" w:w="3312"/>
+            <w:vAlign w:val="center"/>
+          </w:tcPr>
+          <w:p>
+            <w:r>
+              <w:t>8.345</w:t>
+            </w:r>
+          </w:p>
+        </w:tc>
+      </w:tr>
+      <w:tr>
+        <w:tc>
+          <w:tcPr>
+            <w:tcW w:type="dxa" w:w="3456"/>
+            <w:vAlign w:val="center"/>
+          </w:tcPr>
+          <w:p>
+            <w:r>
+              <w:t>OLS</w:t>
+            </w:r>
+          </w:p>
+        </w:tc>
+        <w:tc>
+          <w:tcPr>
+            <w:tcW w:type="dxa" w:w="2592"/>
+            <w:vAlign w:val="center"/>
+          </w:tcPr>
+          <w:p>
+            <w:r>
+              <w:t>0.824</w:t>
+            </w:r>
+          </w:p>
+        </w:tc>
+        <w:tc>
+          <w:tcPr>
+            <w:tcW w:type="dxa" w:w="3312"/>
+            <w:vAlign w:val="center"/>
+          </w:tcPr>
+          <w:p>
+            <w:r>
+              <w:t>8.345</w:t>
+            </w:r>
+          </w:p>
+        </w:tc>
+      </w:tr>
+    </w:tbl>
+    <w:p>
+      <w:r>
+        <w:t>Result: Bagged Huber is the current selection. The weighted ensemble does not beat it on the locked common holdout. Development errors were nearly identical, producing weights close to 20% each, while the four ordinary linear models also made almost identical forecasts. Voting therefore added little independent information.</w:t>
+      </w:r>
+    </w:p>
+    <w:p>
+      <w:r>
+        <w:t>Holdout qualification: the new program enforces computational isolation of Block 19, but an earlier rolling Huber diagnostic already exposed this period's outcome. It is a locked common holdout from this point forward, not a restored pristine human-blind test. A genuinely untouched final test requires future observations not previously inspected.</w:t>
       </w:r>
     </w:p>
     <w:sectPr>

</xml_diff>

<commit_message>
Add locked Bagged Huber PnL ledger
</commit_message>
<xml_diff>
--- a/docs/Gold_Model_Project_Notes.docx
+++ b/docs/Gold_Model_Project_Notes.docx
@@ -7585,6 +7585,448 @@
     <w:p>
       <w:r>
         <w:t>Holdout qualification: the new program enforces computational isolation of Block 19, but an earlier rolling Huber diagnostic already exposed this period's outcome. It is a locked common holdout from this point forward, not a restored pristine human-blind test. A genuinely untouched final test requires future observations not previously inspected.</w:t>
+      </w:r>
+    </w:p>
+    <w:p>
+      <w:pPr>
+        <w:pStyle w:val="Heading1"/>
+      </w:pPr>
+      <w:r>
+        <w:t>Locked Block 19 Bagged Huber position and P&amp;L ledger</w:t>
+      </w:r>
+    </w:p>
+    <w:p>
+      <w:r>
+        <w:t>The trading rule uses only rolling out-of-sample Bagged Huber forecasts from Blocks 10-18 for threshold and position-size selection. A signal is formed after the signal-date close, entered at the next session's open, and closed at that same session's close. The current ledger is a theoretical direct-Au99.99 long/flat simulation, not an ETF execution test.</w:t>
+      </w:r>
+    </w:p>
+    <w:p>
+      <w:r>
+        <w:t>The primary development-selected rule takes no position when the forecast is non-positive. For a positive forecast, target weight equals predicted growth divided by 0.5 times the strictly lagged 20-day realized volatility, capped between zero and 100%. Starting capital is CNY 100,000. Default research costs are 3 basis points commission and 2 basis points adverse slippage per side.</w:t>
+      </w:r>
+    </w:p>
+    <w:tbl>
+      <w:tblPr>
+        <w:tblStyle w:val="TableGrid"/>
+        <w:tblW w:type="auto" w:w="0"/>
+        <w:tblLayout w:type="fixed"/>
+        <w:tblLook w:firstColumn="1" w:firstRow="1" w:lastColumn="0" w:lastRow="0" w:noHBand="0" w:noVBand="1" w:val="04A0"/>
+      </w:tblPr>
+      <w:tblGrid>
+        <w:gridCol w:w="1987"/>
+        <w:gridCol w:w="1987"/>
+        <w:gridCol w:w="1987"/>
+        <w:gridCol w:w="1987"/>
+        <w:gridCol w:w="1987"/>
+      </w:tblGrid>
+      <w:tr>
+        <w:tc>
+          <w:tcPr>
+            <w:tcW w:type="dxa" w:w="3312"/>
+            <w:vAlign w:val="center"/>
+          </w:tcPr>
+          <w:p>
+            <w:r>
+              <w:t>Strategy</w:t>
+            </w:r>
+          </w:p>
+        </w:tc>
+        <w:tc>
+          <w:tcPr>
+            <w:tcW w:type="dxa" w:w="1008"/>
+            <w:vAlign w:val="center"/>
+          </w:tcPr>
+          <w:p>
+            <w:r>
+              <w:t>Trades</w:t>
+            </w:r>
+          </w:p>
+        </w:tc>
+        <w:tc>
+          <w:tcPr>
+            <w:tcW w:type="dxa" w:w="1584"/>
+            <w:vAlign w:val="center"/>
+          </w:tcPr>
+          <w:p>
+            <w:r>
+              <w:t>Total return</w:t>
+            </w:r>
+          </w:p>
+        </w:tc>
+        <w:tc>
+          <w:tcPr>
+            <w:tcW w:type="dxa" w:w="1152"/>
+            <w:vAlign w:val="center"/>
+          </w:tcPr>
+          <w:p>
+            <w:r>
+              <w:t>Sharpe</w:t>
+            </w:r>
+          </w:p>
+        </w:tc>
+        <w:tc>
+          <w:tcPr>
+            <w:tcW w:type="dxa" w:w="1728"/>
+            <w:vAlign w:val="center"/>
+          </w:tcPr>
+          <w:p>
+            <w:r>
+              <w:t>Max drawdown</w:t>
+            </w:r>
+          </w:p>
+        </w:tc>
+      </w:tr>
+      <w:tr>
+        <w:tc>
+          <w:tcPr>
+            <w:tcW w:type="dxa" w:w="3312"/>
+            <w:vAlign w:val="center"/>
+          </w:tcPr>
+          <w:p>
+            <w:r>
+              <w:t>Development-selected volatility sizing</w:t>
+            </w:r>
+          </w:p>
+        </w:tc>
+        <w:tc>
+          <w:tcPr>
+            <w:tcW w:type="dxa" w:w="1008"/>
+            <w:vAlign w:val="center"/>
+          </w:tcPr>
+          <w:p>
+            <w:r>
+              <w:t>87</w:t>
+            </w:r>
+          </w:p>
+        </w:tc>
+        <w:tc>
+          <w:tcPr>
+            <w:tcW w:type="dxa" w:w="1584"/>
+            <w:vAlign w:val="center"/>
+          </w:tcPr>
+          <w:p>
+            <w:r>
+              <w:t>27.54%</w:t>
+            </w:r>
+          </w:p>
+        </w:tc>
+        <w:tc>
+          <w:tcPr>
+            <w:tcW w:type="dxa" w:w="1152"/>
+            <w:vAlign w:val="center"/>
+          </w:tcPr>
+          <w:p>
+            <w:r>
+              <w:t>3.75</w:t>
+            </w:r>
+          </w:p>
+        </w:tc>
+        <w:tc>
+          <w:tcPr>
+            <w:tcW w:type="dxa" w:w="1728"/>
+            <w:vAlign w:val="center"/>
+          </w:tcPr>
+          <w:p>
+            <w:r>
+              <w:t>-4.02%</w:t>
+            </w:r>
+          </w:p>
+        </w:tc>
+      </w:tr>
+      <w:tr>
+        <w:tc>
+          <w:tcPr>
+            <w:tcW w:type="dxa" w:w="3312"/>
+            <w:vAlign w:val="center"/>
+          </w:tcPr>
+          <w:p>
+            <w:r>
+              <w:t>Cost-threshold full position</w:t>
+            </w:r>
+          </w:p>
+        </w:tc>
+        <w:tc>
+          <w:tcPr>
+            <w:tcW w:type="dxa" w:w="1008"/>
+            <w:vAlign w:val="center"/>
+          </w:tcPr>
+          <w:p>
+            <w:r>
+              <w:t>75</w:t>
+            </w:r>
+          </w:p>
+        </w:tc>
+        <w:tc>
+          <w:tcPr>
+            <w:tcW w:type="dxa" w:w="1584"/>
+            <w:vAlign w:val="center"/>
+          </w:tcPr>
+          <w:p>
+            <w:r>
+              <w:t>27.50%</w:t>
+            </w:r>
+          </w:p>
+        </w:tc>
+        <w:tc>
+          <w:tcPr>
+            <w:tcW w:type="dxa" w:w="1152"/>
+            <w:vAlign w:val="center"/>
+          </w:tcPr>
+          <w:p>
+            <w:r>
+              <w:t>3.19</w:t>
+            </w:r>
+          </w:p>
+        </w:tc>
+        <w:tc>
+          <w:tcPr>
+            <w:tcW w:type="dxa" w:w="1728"/>
+            <w:vAlign w:val="center"/>
+          </w:tcPr>
+          <w:p>
+            <w:r>
+              <w:t>-4.70%</w:t>
+            </w:r>
+          </w:p>
+        </w:tc>
+      </w:tr>
+      <w:tr>
+        <w:tc>
+          <w:tcPr>
+            <w:tcW w:type="dxa" w:w="3312"/>
+            <w:vAlign w:val="center"/>
+          </w:tcPr>
+          <w:p>
+            <w:r>
+              <w:t>Zero-threshold full position</w:t>
+            </w:r>
+          </w:p>
+        </w:tc>
+        <w:tc>
+          <w:tcPr>
+            <w:tcW w:type="dxa" w:w="1008"/>
+            <w:vAlign w:val="center"/>
+          </w:tcPr>
+          <w:p>
+            <w:r>
+              <w:t>87</w:t>
+            </w:r>
+          </w:p>
+        </w:tc>
+        <w:tc>
+          <w:tcPr>
+            <w:tcW w:type="dxa" w:w="1584"/>
+            <w:vAlign w:val="center"/>
+          </w:tcPr>
+          <w:p>
+            <w:r>
+              <w:t>25.78%</w:t>
+            </w:r>
+          </w:p>
+        </w:tc>
+        <w:tc>
+          <w:tcPr>
+            <w:tcW w:type="dxa" w:w="1152"/>
+            <w:vAlign w:val="center"/>
+          </w:tcPr>
+          <w:p>
+            <w:r>
+              <w:t>2.78</w:t>
+            </w:r>
+          </w:p>
+        </w:tc>
+        <w:tc>
+          <w:tcPr>
+            <w:tcW w:type="dxa" w:w="1728"/>
+            <w:vAlign w:val="center"/>
+          </w:tcPr>
+          <w:p>
+            <w:r>
+              <w:t>-6.76%</w:t>
+            </w:r>
+          </w:p>
+        </w:tc>
+      </w:tr>
+      <w:tr>
+        <w:tc>
+          <w:tcPr>
+            <w:tcW w:type="dxa" w:w="3312"/>
+            <w:vAlign w:val="center"/>
+          </w:tcPr>
+          <w:p>
+            <w:r>
+              <w:t>Always flat</w:t>
+            </w:r>
+          </w:p>
+        </w:tc>
+        <w:tc>
+          <w:tcPr>
+            <w:tcW w:type="dxa" w:w="1008"/>
+            <w:vAlign w:val="center"/>
+          </w:tcPr>
+          <w:p>
+            <w:r>
+              <w:t>0</w:t>
+            </w:r>
+          </w:p>
+        </w:tc>
+        <w:tc>
+          <w:tcPr>
+            <w:tcW w:type="dxa" w:w="1584"/>
+            <w:vAlign w:val="center"/>
+          </w:tcPr>
+          <w:p>
+            <w:r>
+              <w:t>0.00%</w:t>
+            </w:r>
+          </w:p>
+        </w:tc>
+        <w:tc>
+          <w:tcPr>
+            <w:tcW w:type="dxa" w:w="1152"/>
+            <w:vAlign w:val="center"/>
+          </w:tcPr>
+          <w:p>
+            <w:r>
+              <w:t>0.00</w:t>
+            </w:r>
+          </w:p>
+        </w:tc>
+        <w:tc>
+          <w:tcPr>
+            <w:tcW w:type="dxa" w:w="1728"/>
+            <w:vAlign w:val="center"/>
+          </w:tcPr>
+          <w:p>
+            <w:r>
+              <w:t>0.00%</w:t>
+            </w:r>
+          </w:p>
+        </w:tc>
+      </w:tr>
+      <w:tr>
+        <w:tc>
+          <w:tcPr>
+            <w:tcW w:type="dxa" w:w="3312"/>
+            <w:vAlign w:val="center"/>
+          </w:tcPr>
+          <w:p>
+            <w:r>
+              <w:t>Buy and hold</w:t>
+            </w:r>
+          </w:p>
+        </w:tc>
+        <w:tc>
+          <w:tcPr>
+            <w:tcW w:type="dxa" w:w="1008"/>
+            <w:vAlign w:val="center"/>
+          </w:tcPr>
+          <w:p>
+            <w:r>
+              <w:t>1</w:t>
+            </w:r>
+          </w:p>
+        </w:tc>
+        <w:tc>
+          <w:tcPr>
+            <w:tcW w:type="dxa" w:w="1584"/>
+            <w:vAlign w:val="center"/>
+          </w:tcPr>
+          <w:p>
+            <w:r>
+              <w:t>-8.55%</w:t>
+            </w:r>
+          </w:p>
+        </w:tc>
+        <w:tc>
+          <w:tcPr>
+            <w:tcW w:type="dxa" w:w="1152"/>
+            <w:vAlign w:val="center"/>
+          </w:tcPr>
+          <w:p>
+            <w:r>
+              <w:t>-0.47</w:t>
+            </w:r>
+          </w:p>
+        </w:tc>
+        <w:tc>
+          <w:tcPr>
+            <w:tcW w:type="dxa" w:w="1728"/>
+            <w:vAlign w:val="center"/>
+          </w:tcPr>
+          <w:p>
+            <w:r>
+              <w:t>-22.29%</w:t>
+            </w:r>
+          </w:p>
+        </w:tc>
+      </w:tr>
+      <w:tr>
+        <w:tc>
+          <w:tcPr>
+            <w:tcW w:type="dxa" w:w="3312"/>
+            <w:vAlign w:val="center"/>
+          </w:tcPr>
+          <w:p>
+            <w:r>
+              <w:t>Always-long intraday</w:t>
+            </w:r>
+          </w:p>
+        </w:tc>
+        <w:tc>
+          <w:tcPr>
+            <w:tcW w:type="dxa" w:w="1008"/>
+            <w:vAlign w:val="center"/>
+          </w:tcPr>
+          <w:p>
+            <w:r>
+              <w:t>143</w:t>
+            </w:r>
+          </w:p>
+        </w:tc>
+        <w:tc>
+          <w:tcPr>
+            <w:tcW w:type="dxa" w:w="1584"/>
+            <w:vAlign w:val="center"/>
+          </w:tcPr>
+          <w:p>
+            <w:r>
+              <w:t>-17.90%</w:t>
+            </w:r>
+          </w:p>
+        </w:tc>
+        <w:tc>
+          <w:tcPr>
+            <w:tcW w:type="dxa" w:w="1152"/>
+            <w:vAlign w:val="center"/>
+          </w:tcPr>
+          <w:p>
+            <w:r>
+              <w:t>-1.61</w:t>
+            </w:r>
+          </w:p>
+        </w:tc>
+        <w:tc>
+          <w:tcPr>
+            <w:tcW w:type="dxa" w:w="1728"/>
+            <w:vAlign w:val="center"/>
+          </w:tcPr>
+          <w:p>
+            <w:r>
+              <w:t>-24.80%</w:t>
+            </w:r>
+          </w:p>
+        </w:tc>
+      </w:tr>
+    </w:tbl>
+    <w:p>
+      <w:r>
+        <w:t>The primary rule earns CNY 27,542 net of approximately CNY 5,752 trading costs in the locked period. Its total return remains 21.40% when both commission and slippage assumptions are doubled. Every trade and capital transition reconciles as gross P&amp;L minus slippage and commission.</w:t>
+      </w:r>
+    </w:p>
+    <w:p>
+      <w:r>
+        <w:t>Stability warning: only six of the nine development blocks are profitable. The strategy loses money in several 2020-2022 blocks and performs strongly from late 2022 onward, indicating regime dependence. The 27.54% result is not a live-performance claim. Fractional grams, fixed costs and direct Au99.99 prices will not reproduce ETF or futures execution. Block 19 is computationally excluded from rule selection but was exposed in earlier model diagnostics.</w:t>
       </w:r>
     </w:p>
     <w:sectPr>

</xml_diff>

<commit_message>
Switch maintained target to international XAUUSD
</commit_message>
<xml_diff>
--- a/docs/Gold_Model_Project_Notes.docx
+++ b/docs/Gold_Model_Project_Notes.docx
@@ -8027,6 +8027,131 @@
     <w:p>
       <w:r>
         <w:t>Stability warning: only six of the nine development blocks are profitable. The strategy loses money in several 2020-2022 blocks and performs strongly from late 2022 onward, indicating regime dependence. The 27.54% result is not a live-performance claim. Fractional grams, fixed costs and direct Au99.99 prices will not reproduce ETF or futures execution. Block 19 is computationally excluded from rule selection but was exposed in earlier model diagnostics.</w:t>
+      </w:r>
+    </w:p>
+    <w:p>
+      <w:r>
+        <w:br w:type="page"/>
+      </w:r>
+    </w:p>
+    <w:p>
+      <w:pPr>
+        <w:pStyle w:val="Heading1"/>
+      </w:pPr>
+      <w:r>
+        <w:t>International XAU/USD source migration - 2026-07-24</w:t>
+      </w:r>
+    </w:p>
+    <w:p>
+      <w:r>
+        <w:t>The maintained prediction target has been switched from Shanghai Gold Exchange Au99.99 in CNY per gram to FXCM XAU/USD in USD per troy ounce. The old Chinese-gold code remains as a legacy comparison and is not used by the new international target loader.</w:t>
+      </w:r>
+    </w:p>
+    <w:p>
+      <w:pPr>
+        <w:pStyle w:val="Heading2"/>
+      </w:pPr>
+      <w:r>
+        <w:t>Source and target rules</w:t>
+      </w:r>
+    </w:p>
+    <w:p>
+      <w:pPr>
+        <w:pStyle w:val="ListBullet"/>
+      </w:pPr>
+      <w:r>
+        <w:t>Preferred source: Tushare fx_daily, XAUUSD.FXCM, with GMT-dated bid and ask OHLC fields.</w:t>
+      </w:r>
+    </w:p>
+    <w:p>
+      <w:pPr>
+        <w:pStyle w:val="ListBullet"/>
+      </w:pPr>
+      <w:r>
+        <w:t>Preferred horizon-one label: log(next-session mid close / next-session mid open).</w:t>
+      </w:r>
+    </w:p>
+    <w:p>
+      <w:pPr>
+        <w:pStyle w:val="ListBullet"/>
+      </w:pPr>
+      <w:r>
+        <w:t>Current fallback: recover the previously cached Tushare/FXCM mid-close sequence and undo its old one-session Shanghai alignment.</w:t>
+      </w:r>
+    </w:p>
+    <w:p>
+      <w:pPr>
+        <w:pStyle w:val="ListBullet"/>
+      </w:pPr>
+      <w:r>
+        <w:t>Fallback label: log(next-session mid close / signal-session mid close). It is research-only because no next open or spread exists.</w:t>
+      </w:r>
+    </w:p>
+    <w:p>
+      <w:pPr>
+        <w:pStyle w:val="ListBullet"/>
+      </w:pPr>
+      <w:r>
+        <w:t>SGE price, Shanghai premium, and SHFE gold variables are excluded from the international target model.</w:t>
+      </w:r>
+    </w:p>
+    <w:p>
+      <w:pPr>
+        <w:pStyle w:val="Heading2"/>
+      </w:pPr>
+      <w:r>
+        <w:t>Leakage controls and model comparison</w:t>
+      </w:r>
+    </w:p>
+    <w:p>
+      <w:r>
+        <w:t>The usable international sample is divided into 19 equal chronological blocks of 163 observations after excluding 17 oldest remainder rows. Blocks 1-9 select features using the existing p-value-constrained AIC rule. Block 10 selects model parameters by growth MAE. Blocks 11-18 estimate normalized inverse-growth-MAE voting weights. Blocks 10-18 fit the frozen final models, with unavailable end labels purged, and Block 19 is opened only for the common comparison.</w:t>
+      </w:r>
+    </w:p>
+    <w:p>
+      <w:r>
+        <w:t>The five candidates remain OLS, Ridge, Lasso, Elastic Net, and moving-block-bagged Huber. Directional accuracy is not an objective; the reported quantities are growth MAE/RMSE in percentage points and price MAE/RMSE in USD per troy ounce.</w:t>
+      </w:r>
+    </w:p>
+    <w:p>
+      <w:pPr>
+        <w:pStyle w:val="Heading2"/>
+      </w:pPr>
+      <w:r>
+        <w:t>First international result</w:t>
+      </w:r>
+    </w:p>
+    <w:p>
+      <w:r>
+        <w:t>The current Tushare token failed the FXCM endpoint smoke test, so the completed run used the verified close-only fallback. Training-only AIC retained seven factors: one-session XAU/USD return, five-session XAU/USD momentum, 20-session XAU/USD volatility, one-session oil return, one-session real-yield change, 10-year breakeven inflation, and the GVZ level.</w:t>
+      </w:r>
+    </w:p>
+    <w:p>
+      <w:r>
+        <w:t>On Block 19, the zero-return baseline had the lowest growth MAE at 1.2775 percentage points. Lasso and Elastic Net each had 1.2781; the weighted ensemble had 1.2807. The best model therefore did not beat the zero forecast. The price graph looks much closer than the return graph because each predicted next close starts from the known current close; that visual persistence is not forecast skill.</w:t>
+      </w:r>
+    </w:p>
+    <w:p>
+      <w:r>
+        <w:t>Decision: the data-source migration is complete, but the present international close-to-close model is not eligible for a trading P&amp;L claim. The next data step is to restore a valid fx_daily token, rerun with --target-mode open_to_close, and evaluate bid/ask-aware execution before designing a strategy.</w:t>
+      </w:r>
+    </w:p>
+    <w:p>
+      <w:pPr>
+        <w:pStyle w:val="Heading2"/>
+      </w:pPr>
+      <w:r>
+        <w:t>Reproduction</w:t>
+      </w:r>
+    </w:p>
+    <w:p>
+      <w:r>
+        <w:t>Run: python international_gold_model.py --horizon 1</w:t>
+      </w:r>
+    </w:p>
+    <w:p>
+      <w:r>
+        <w:t>Require full OHLC: python international_gold_model.py --horizon 1 --refresh --target-mode open_to_close</w:t>
       </w:r>
     </w:p>
     <w:sectPr>

</xml_diff>